<commit_message>
feat: categories checkbox on report button
</commit_message>
<xml_diff>
--- a/templates/loan-ready2.docx
+++ b/templates/loan-ready2.docx
@@ -396,7 +396,25 @@
                 <w:sz w:val="18"/>
                 <w:szCs w:val="18"/>
               </w:rPr>
-              <w:t>{numero_de}</w:t>
+              <w:t>{</w:t>
+            </w:r>
+            <w:proofErr w:type="spellStart"/>
+            <w:r>
+              <w:rPr>
+                <w:rFonts w:ascii="Arial" w:hAnsi="Arial" w:cs="Arial"/>
+                <w:sz w:val="18"/>
+                <w:szCs w:val="18"/>
+              </w:rPr>
+              <w:t>numero_de</w:t>
+            </w:r>
+            <w:proofErr w:type="spellEnd"/>
+            <w:r>
+              <w:rPr>
+                <w:rFonts w:ascii="Arial" w:hAnsi="Arial" w:cs="Arial"/>
+                <w:sz w:val="18"/>
+                <w:szCs w:val="18"/>
+              </w:rPr>
+              <w:t>}</w:t>
             </w:r>
           </w:p>
         </w:tc>
@@ -511,6 +529,7 @@
         </w:rPr>
         <w:t>{/</w:t>
       </w:r>
+      <w:proofErr w:type="spellStart"/>
       <w:r>
         <w:rPr>
           <w:rFonts w:ascii="Arial" w:hAnsi="Arial" w:cs="Arial"/>
@@ -525,7 +544,16 @@
           <w:sz w:val="18"/>
           <w:szCs w:val="18"/>
         </w:rPr>
-        <w:t>equipments}</w:t>
+        <w:t>equipments</w:t>
+      </w:r>
+      <w:proofErr w:type="spellEnd"/>
+      <w:r>
+        <w:rPr>
+          <w:rFonts w:ascii="Arial" w:hAnsi="Arial" w:cs="Arial"/>
+          <w:sz w:val="18"/>
+          <w:szCs w:val="18"/>
+        </w:rPr>
+        <w:t>}</w:t>
       </w:r>
     </w:p>
     <w:p>
@@ -617,7 +645,7 @@
     </w:p>
     <w:p>
       <w:pPr>
-        <w:spacing w:beforeLines="20" w:before="48" w:afterLines="20" w:after="48" w:line="240" w:lineRule="auto"/>
+        <w:spacing w:beforeLines="20" w:before="48" w:afterLines="20" w:after="48" w:line="360" w:lineRule="auto"/>
         <w:jc w:val="center"/>
         <w:rPr>
           <w:rFonts w:ascii="Arial" w:hAnsi="Arial" w:cs="Arial"/>
@@ -951,7 +979,25 @@
                 <w:sz w:val="18"/>
                 <w:szCs w:val="18"/>
               </w:rPr>
-              <w:t>{numero_de}</w:t>
+              <w:t>{</w:t>
+            </w:r>
+            <w:proofErr w:type="spellStart"/>
+            <w:r>
+              <w:rPr>
+                <w:rFonts w:ascii="Arial" w:hAnsi="Arial" w:cs="Arial"/>
+                <w:sz w:val="18"/>
+                <w:szCs w:val="18"/>
+              </w:rPr>
+              <w:t>numero_de</w:t>
+            </w:r>
+            <w:proofErr w:type="spellEnd"/>
+            <w:r>
+              <w:rPr>
+                <w:rFonts w:ascii="Arial" w:hAnsi="Arial" w:cs="Arial"/>
+                <w:sz w:val="18"/>
+                <w:szCs w:val="18"/>
+              </w:rPr>
+              <w:t>}</w:t>
             </w:r>
           </w:p>
         </w:tc>
@@ -997,7 +1043,25 @@
                 <w:sz w:val="18"/>
                 <w:szCs w:val="18"/>
               </w:rPr>
-              <w:t>{condicao}</w:t>
+              <w:t>{</w:t>
+            </w:r>
+            <w:proofErr w:type="spellStart"/>
+            <w:r>
+              <w:rPr>
+                <w:rFonts w:ascii="Arial" w:hAnsi="Arial" w:cs="Arial"/>
+                <w:sz w:val="18"/>
+                <w:szCs w:val="18"/>
+              </w:rPr>
+              <w:t>condicao</w:t>
+            </w:r>
+            <w:proofErr w:type="spellEnd"/>
+            <w:r>
+              <w:rPr>
+                <w:rFonts w:ascii="Arial" w:hAnsi="Arial" w:cs="Arial"/>
+                <w:sz w:val="18"/>
+                <w:szCs w:val="18"/>
+              </w:rPr>
+              <w:t>}</w:t>
             </w:r>
           </w:p>
         </w:tc>
@@ -1043,7 +1107,25 @@
                 <w:sz w:val="18"/>
                 <w:szCs w:val="18"/>
               </w:rPr>
-              <w:t>{preco}</w:t>
+              <w:t>{</w:t>
+            </w:r>
+            <w:proofErr w:type="spellStart"/>
+            <w:r>
+              <w:rPr>
+                <w:rFonts w:ascii="Arial" w:hAnsi="Arial" w:cs="Arial"/>
+                <w:sz w:val="18"/>
+                <w:szCs w:val="18"/>
+              </w:rPr>
+              <w:t>preco</w:t>
+            </w:r>
+            <w:proofErr w:type="spellEnd"/>
+            <w:r>
+              <w:rPr>
+                <w:rFonts w:ascii="Arial" w:hAnsi="Arial" w:cs="Arial"/>
+                <w:sz w:val="18"/>
+                <w:szCs w:val="18"/>
+              </w:rPr>
+              <w:t>}</w:t>
             </w:r>
           </w:p>
         </w:tc>
@@ -1066,6 +1148,7 @@
         </w:rPr>
         <w:t>{/</w:t>
       </w:r>
+      <w:proofErr w:type="spellStart"/>
       <w:r>
         <w:rPr>
           <w:rFonts w:ascii="Arial" w:hAnsi="Arial" w:cs="Arial"/>
@@ -1080,7 +1163,16 @@
           <w:sz w:val="18"/>
           <w:szCs w:val="18"/>
         </w:rPr>
-        <w:t>quipments}</w:t>
+        <w:t>quipments</w:t>
+      </w:r>
+      <w:proofErr w:type="spellEnd"/>
+      <w:r>
+        <w:rPr>
+          <w:rFonts w:ascii="Arial" w:hAnsi="Arial" w:cs="Arial"/>
+          <w:sz w:val="18"/>
+          <w:szCs w:val="18"/>
+        </w:rPr>
+        <w:t>}</w:t>
       </w:r>
     </w:p>
     <w:tbl>
@@ -1144,7 +1236,25 @@
                 <w:sz w:val="18"/>
                 <w:szCs w:val="18"/>
               </w:rPr>
-              <w:t>{dataProco}</w:t>
+              <w:t>{</w:t>
+            </w:r>
+            <w:proofErr w:type="spellStart"/>
+            <w:r>
+              <w:rPr>
+                <w:rFonts w:ascii="Arial" w:hAnsi="Arial" w:cs="Arial"/>
+                <w:sz w:val="18"/>
+                <w:szCs w:val="18"/>
+              </w:rPr>
+              <w:t>dataProco</w:t>
+            </w:r>
+            <w:proofErr w:type="spellEnd"/>
+            <w:r>
+              <w:rPr>
+                <w:rFonts w:ascii="Arial" w:hAnsi="Arial" w:cs="Arial"/>
+                <w:sz w:val="18"/>
+                <w:szCs w:val="18"/>
+              </w:rPr>
+              <w:t>}</w:t>
             </w:r>
           </w:p>
         </w:tc>
@@ -1279,6 +1389,11 @@
         <w:docPartUnique/>
       </w:docPartObj>
     </w:sdtPr>
+    <w:sdtEndPr>
+      <w:rPr>
+        <w:rStyle w:val="Nmerodepgina"/>
+      </w:rPr>
+    </w:sdtEndPr>
     <w:sdtContent>
       <w:p>
         <w:pPr>
@@ -1331,6 +1446,11 @@
         <w:docPartUnique/>
       </w:docPartObj>
     </w:sdtPr>
+    <w:sdtEndPr>
+      <w:rPr>
+        <w:rStyle w:val="Nmerodepgina"/>
+      </w:rPr>
+    </w:sdtEndPr>
     <w:sdtContent>
       <w:p>
         <w:pPr>
@@ -1821,14 +1941,34 @@
                                     <w:szCs w:val="16"/>
                                   </w:rPr>
                                 </w:pPr>
+                                <w:proofErr w:type="spellStart"/>
                                 <w:r>
                                   <w:rPr>
                                     <w:rFonts w:ascii="Arial" w:hAnsi="Arial" w:cs="Arial"/>
                                     <w:sz w:val="16"/>
                                     <w:szCs w:val="16"/>
                                   </w:rPr>
-                                  <w:t>Ch Sala Int</w:t>
+                                  <w:t>Ch</w:t>
                                 </w:r>
+                                <w:proofErr w:type="spellEnd"/>
+                                <w:r>
+                                  <w:rPr>
+                                    <w:rFonts w:ascii="Arial" w:hAnsi="Arial" w:cs="Arial"/>
+                                    <w:sz w:val="16"/>
+                                    <w:szCs w:val="16"/>
+                                  </w:rPr>
+                                  <w:t xml:space="preserve"> Sala </w:t>
+                                </w:r>
+                                <w:proofErr w:type="spellStart"/>
+                                <w:r>
+                                  <w:rPr>
+                                    <w:rFonts w:ascii="Arial" w:hAnsi="Arial" w:cs="Arial"/>
+                                    <w:sz w:val="16"/>
+                                    <w:szCs w:val="16"/>
+                                  </w:rPr>
+                                  <w:t>Int</w:t>
+                                </w:r>
+                                <w:proofErr w:type="spellEnd"/>
                               </w:p>
                             </w:tc>
                           </w:tr>
@@ -1946,14 +2086,34 @@
                               <w:szCs w:val="16"/>
                             </w:rPr>
                           </w:pPr>
+                          <w:proofErr w:type="spellStart"/>
                           <w:r>
                             <w:rPr>
                               <w:rFonts w:ascii="Arial" w:hAnsi="Arial" w:cs="Arial"/>
                               <w:sz w:val="16"/>
                               <w:szCs w:val="16"/>
                             </w:rPr>
-                            <w:t>Ch Sala Int</w:t>
+                            <w:t>Ch</w:t>
                           </w:r>
+                          <w:proofErr w:type="spellEnd"/>
+                          <w:r>
+                            <w:rPr>
+                              <w:rFonts w:ascii="Arial" w:hAnsi="Arial" w:cs="Arial"/>
+                              <w:sz w:val="16"/>
+                              <w:szCs w:val="16"/>
+                            </w:rPr>
+                            <w:t xml:space="preserve"> Sala </w:t>
+                          </w:r>
+                          <w:proofErr w:type="spellStart"/>
+                          <w:r>
+                            <w:rPr>
+                              <w:rFonts w:ascii="Arial" w:hAnsi="Arial" w:cs="Arial"/>
+                              <w:sz w:val="16"/>
+                              <w:szCs w:val="16"/>
+                            </w:rPr>
+                            <w:t>Int</w:t>
+                          </w:r>
+                          <w:proofErr w:type="spellEnd"/>
                         </w:p>
                       </w:tc>
                     </w:tr>
@@ -2103,13 +2263,23 @@
                                     <w:szCs w:val="16"/>
                                   </w:rPr>
                                 </w:pPr>
+                                <w:proofErr w:type="spellStart"/>
                                 <w:r>
                                   <w:rPr>
                                     <w:rFonts w:ascii="Arial" w:hAnsi="Arial" w:cs="Arial"/>
                                     <w:sz w:val="16"/>
                                     <w:szCs w:val="16"/>
                                   </w:rPr>
-                                  <w:t>Ch Sala Rádio</w:t>
+                                  <w:t>Ch</w:t>
+                                </w:r>
+                                <w:proofErr w:type="spellEnd"/>
+                                <w:r>
+                                  <w:rPr>
+                                    <w:rFonts w:ascii="Arial" w:hAnsi="Arial" w:cs="Arial"/>
+                                    <w:sz w:val="16"/>
+                                    <w:szCs w:val="16"/>
+                                  </w:rPr>
+                                  <w:t xml:space="preserve"> Sala Rádio</w:t>
                                 </w:r>
                               </w:p>
                             </w:tc>
@@ -2224,13 +2394,23 @@
                               <w:szCs w:val="16"/>
                             </w:rPr>
                           </w:pPr>
+                          <w:proofErr w:type="spellStart"/>
                           <w:r>
                             <w:rPr>
                               <w:rFonts w:ascii="Arial" w:hAnsi="Arial" w:cs="Arial"/>
                               <w:sz w:val="16"/>
                               <w:szCs w:val="16"/>
                             </w:rPr>
-                            <w:t>Ch Sala Rádio</w:t>
+                            <w:t>Ch</w:t>
+                          </w:r>
+                          <w:proofErr w:type="spellEnd"/>
+                          <w:r>
+                            <w:rPr>
+                              <w:rFonts w:ascii="Arial" w:hAnsi="Arial" w:cs="Arial"/>
+                              <w:sz w:val="16"/>
+                              <w:szCs w:val="16"/>
+                            </w:rPr>
+                            <w:t xml:space="preserve"> Sala Rádio</w:t>
                           </w:r>
                         </w:p>
                       </w:tc>
@@ -2387,7 +2567,25 @@
                                     <w:sz w:val="16"/>
                                     <w:szCs w:val="16"/>
                                   </w:rPr>
-                                  <w:t>Cmt Pel Com</w:t>
+                                  <w:t xml:space="preserve">Cmt </w:t>
+                                </w:r>
+                                <w:proofErr w:type="spellStart"/>
+                                <w:r>
+                                  <w:rPr>
+                                    <w:rFonts w:ascii="Arial" w:hAnsi="Arial" w:cs="Arial"/>
+                                    <w:sz w:val="16"/>
+                                    <w:szCs w:val="16"/>
+                                  </w:rPr>
+                                  <w:t>Pel</w:t>
+                                </w:r>
+                                <w:proofErr w:type="spellEnd"/>
+                                <w:r>
+                                  <w:rPr>
+                                    <w:rFonts w:ascii="Arial" w:hAnsi="Arial" w:cs="Arial"/>
+                                    <w:sz w:val="16"/>
+                                    <w:szCs w:val="16"/>
+                                  </w:rPr>
+                                  <w:t xml:space="preserve"> Com</w:t>
                                 </w:r>
                               </w:p>
                             </w:tc>
@@ -2508,7 +2706,25 @@
                               <w:sz w:val="16"/>
                               <w:szCs w:val="16"/>
                             </w:rPr>
-                            <w:t>Cmt Pel Com</w:t>
+                            <w:t xml:space="preserve">Cmt </w:t>
+                          </w:r>
+                          <w:proofErr w:type="spellStart"/>
+                          <w:r>
+                            <w:rPr>
+                              <w:rFonts w:ascii="Arial" w:hAnsi="Arial" w:cs="Arial"/>
+                              <w:sz w:val="16"/>
+                              <w:szCs w:val="16"/>
+                            </w:rPr>
+                            <w:t>Pel</w:t>
+                          </w:r>
+                          <w:proofErr w:type="spellEnd"/>
+                          <w:r>
+                            <w:rPr>
+                              <w:rFonts w:ascii="Arial" w:hAnsi="Arial" w:cs="Arial"/>
+                              <w:sz w:val="16"/>
+                              <w:szCs w:val="16"/>
+                            </w:rPr>
+                            <w:t xml:space="preserve"> Com</w:t>
                           </w:r>
                         </w:p>
                       </w:tc>

</xml_diff>